<commit_message>
🙏Fixed a part of the prayer (僕→私)
</commit_message>
<xml_diff>
--- a/prayer.docx
+++ b/prayer.docx
@@ -1634,9 +1634,15 @@
       </w:pPr>
       <w:r>
         <w:rPr>
-          <w:rFonts w:ascii="MS Mincho" w:eastAsia="MS Mincho" w:hAnsi="MS Mincho"/>
-        </w:rPr>
-        <w:t>僕は静かな心で、長く待ち望んだ</w:t>
+          <w:rFonts w:ascii="MS Mincho" w:eastAsia="MS Mincho" w:hAnsi="MS Mincho" w:hint="eastAsia"/>
+        </w:rPr>
+        <w:t>私</w:t>
+      </w:r>
+      <w:r>
+        <w:rPr>
+          <w:rFonts w:ascii="MS Mincho" w:eastAsia="MS Mincho" w:hAnsi="MS Mincho"/>
+        </w:rPr>
+        <w:t>は静かな心で、長く待ち望んだ</w:t>
       </w:r>
       <w:r>
         <w:rPr>

</xml_diff>